<commit_message>
Align report with notebook(NBK data preparation)
</commit_message>
<xml_diff>
--- a/DCP SIS1 Project/DCP SIS1 Report.docx
+++ b/DCP SIS1 Project/DCP SIS1 Report.docx
@@ -734,7 +734,7 @@
           <w:sz w:val="24"/>
           <w:szCs w:val="24"/>
         </w:rPr>
-        <w:t>How have consumer loan rates behaved over the long run relative to inflation and other macroeconomic indicators (2005–2026)?</w:t>
+        <w:t>How have rates on loans to individuals behaved over the long run relative to inflation and other macroeconomic indicators (2005–2026)?</w:t>
       </w:r>
     </w:p>
     <w:p>
@@ -756,7 +756,7 @@
           <w:sz w:val="24"/>
           <w:szCs w:val="24"/>
         </w:rPr>
-        <w:t>Today, how expensive are consumer loans at individual banks compared with inflation, the National Bank of Kazakhstan (NBK) base rate and the market average?</w:t>
+        <w:t>Today, how expensive are consumer loans at individual banks compared with inflation, the National Bank of Kazakhstan (NBK) base rate and the NBK loan-rate reference?</w:t>
       </w:r>
     </w:p>
     <w:p>
@@ -1276,7 +1276,7 @@
                 <w:sz w:val="24"/>
                 <w:szCs w:val="24"/>
               </w:rPr>
-              <w:t>Average interest rate on loans to individuals, monthly</w:t>
+              <w:t>Monthly NBK weighted average rate on loans to individuals, including individual entrepreneurs, in national currency (KZT), %</w:t>
             </w:r>
           </w:p>
         </w:tc>
@@ -1541,7 +1541,7 @@
           <w:sz w:val="24"/>
           <w:szCs w:val="24"/>
         </w:rPr>
-        <w:t xml:space="preserve"> The Excel table has a non-standard layout: month labels are in one row and values in another. They were extracted by column position, and mixed date formats (such as "</w:t>
+        <w:t xml:space="preserve"> The notebook loads the supplied workbook from the project folder and checks the file, sheet and indicator row. Month labels and rates are converted to appropriate types. It checks missing values, exact duplicates, conflicting monthly rates and gaps in the monthly calendar. The prepared series contains 260 consecutive months (January 2005–August 2026). Annual figures are simple means of monthly rates, with month counts and a full-year flag; 2026 covers January–August only (8 months).</w:t>
       </w:r>
       <w:proofErr w:type="gramStart"/>
       <w:r>
@@ -1550,7 +1550,7 @@
           <w:sz w:val="24"/>
           <w:szCs w:val="24"/>
         </w:rPr>
-        <w:t>MM.YY</w:t>
+        <w:t/>
       </w:r>
       <w:proofErr w:type="gramEnd"/>
       <w:r>
@@ -1559,7 +1559,7 @@
           <w:sz w:val="24"/>
           <w:szCs w:val="24"/>
         </w:rPr>
-        <w:t>" text and real dates) were unified into a single date type. The final monthly series has 260 months with no gaps (expected 260) and no duplicates. It was aggregated to annual means for merging with the World Bank data.</w:t>
+        <w:t/>
       </w:r>
     </w:p>
     <w:p>
@@ -1604,7 +1604,7 @@
           <w:sz w:val="24"/>
           <w:szCs w:val="24"/>
         </w:rPr>
-        <w:t>, is the average loan rate minus inflation, a simple proxy for the real cost of credit. The bank table was enriched with three spreads: effective rate minus inflation, minus the base rate and minus the market average rate.</w:t>
+        <w:t>, is the average loan rate minus inflation, a simple proxy for the real cost of credit. The bank table was enriched with three spreads: effective rate minus inflation, minus the base rate and minus the NBK monthly weighted average rate on loans to individuals, used as a reference for a different loan-rate measure.</w:t>
       </w:r>
     </w:p>
     <w:p>
@@ -1655,7 +1655,7 @@
           <w:sz w:val="24"/>
           <w:szCs w:val="24"/>
         </w:rPr>
-        <w:t>The average consumer loan rate was remarkably stable compared with inflation.</w:t>
+        <w:t>The annual mean NBK rate on loans to individuals was relatively stable compared with inflation.</w:t>
       </w:r>
     </w:p>
     <w:tbl>
@@ -1787,7 +1787,7 @@
                 <w:sz w:val="24"/>
                 <w:szCs w:val="24"/>
               </w:rPr>
-              <w:t>Average loan rate (%)</w:t>
+              <w:t>NBK loan rate (%)</w:t>
             </w:r>
           </w:p>
         </w:tc>
@@ -2143,7 +2143,7 @@
           <w:sz w:val="24"/>
           <w:szCs w:val="24"/>
         </w:rPr>
-        <w:t>The loan rate stays within a band of about 17–22%, while inflation swings between roughly 5% and 17%. The most recent annual averages show a gradual increase: 17.29% in 2022, 19.23% in 2023, 19.93% in 2024, 21.06% in 2025 and 21.99% for January–August 2026.</w:t>
+        <w:t>The annual mean loan rate stays within a band of about 17–22%, while inflation swings between roughly 5% and 17%. The most recent annual averages show a gradual increase: 17.29% in 2022, 19.23% in 2023, 19.93% in 2024, 21.06% in 2025 and 21.99% for January–August 2026.</w:t>
       </w:r>
     </w:p>
     <w:p>
@@ -2213,7 +2213,7 @@
           <w:sz w:val="24"/>
           <w:szCs w:val="24"/>
         </w:rPr>
-        <w:t>Figure 1. Consumer credit rates stay within 17-22% while inflation swings between 5% and 17%; grey bands mark the 2008-09 crisis, the 2015-16 tenge float, COVID-19 and the 2022-23 shock.</w:t>
+        <w:t>Figure 1. Monthly NBK weighted average rates on loans to individuals and annual inflation; grey bands mark the 2008-09 crisis, the 2015-16 tenge float, COVID-19 and the 2022-23 shock.</w:t>
       </w:r>
     </w:p>
     <w:p>
@@ -2913,7 +2913,7 @@
           <w:sz w:val="24"/>
           <w:szCs w:val="24"/>
         </w:rPr>
-        <w:t>The real cost of credit was highest in calm, low-inflation years (2012–2013, 2018–2019) and lowest in years of inflation shocks: the 2008 crisis, the 2015–2016 tenge float and the 2022–2023 shock. In no year did the average loan rate fall below inflation. In 2026 the average rate (21.99%) exceeds August inflation (9.8%) by about 12.2 p.p.</w:t>
+        <w:t>The rate–inflation gap was highest in calm, low-inflation years (2012–2013, 2018–2019) and lowest in years of inflation shocks: the 2008 crisis, the 2015–2016 tenge float and the 2022–2023 shock. Across the 19 years with both annual series (2005–2023), the NBK loan rate was above inflation. The January–August 2026 mean (21.99%) exceeds August inflation (9.8%) by about 12.2 p.p.</w:t>
       </w:r>
     </w:p>
     <w:p>
@@ -2981,7 +2981,7 @@
           <w:sz w:val="24"/>
           <w:szCs w:val="24"/>
         </w:rPr>
-        <w:t>Figure 3. Average consumer loan rate minus inflation (percentage points). The 2026 bar compares the January-August average rate with August inflation.</w:t>
+        <w:t>Figure 3. Mean monthly NBK rate on loans to individuals minus annual inflation (percentage points). The 2026 bar compares the January–August mean (8 months) with August inflation.</w:t>
       </w:r>
     </w:p>
     <w:p>
@@ -3590,7 +3590,7 @@
           <w:szCs w:val="24"/>
         </w:rPr>
         <w:lastRenderedPageBreak/>
-        <w:t>The correlation between inflation and the loan rate is weak and slightly negative (r = −0.15, n = 19), so there is no evidence that banks raise consumer loan rates when inflation rises. The only strong relationship is the expected one between GDP per capita and unemployment (r = −0.78). The loan rate is almost uncorrelated with all macro indicators.</w:t>
+        <w:t>The annual NBK loan-rate series has a weak, slightly negative correlation with annual inflation over 2005–2023 (r = −0.15, n = 19). The strongest correlation in the table is between GDP per capita and unemployment (r = −0.78). Correlations involving the NBK loan rate are weak in this sample.</w:t>
       </w:r>
     </w:p>
     <w:p>
@@ -3658,7 +3658,7 @@
           <w:sz w:val="24"/>
           <w:szCs w:val="24"/>
         </w:rPr>
-        <w:t>Figure 4. Inflation vs average loan rate (r = -0.15, n = 19): the fitted line is nearly flat.</w:t>
+        <w:t>Figure 4. Inflation vs the NBK average rate on loans to individuals (r = -0.15, n = 19): the fitted line is nearly flat.</w:t>
       </w:r>
     </w:p>
     <w:p>
@@ -4968,7 +4968,7 @@
           <w:sz w:val="24"/>
           <w:szCs w:val="24"/>
         </w:rPr>
-        <w:t>Compared with the references, the average bank is 15.8 p.p. above inflation (9.8%), 9.4 p.p. above the NBK base rate (16.25%) and 3.7 p.p. above the market average (21.93%).</w:t>
+        <w:t>The mean effective rate exceeds inflation (9.8%) by 15.8 p.p., the NBK base rate (16.25%) by 9.4 p.p. and the NBK reference (21.93%) by 3.7 p.p.</w:t>
       </w:r>
     </w:p>
     <w:p>
@@ -4990,7 +4990,7 @@
           <w:sz w:val="24"/>
           <w:szCs w:val="24"/>
         </w:rPr>
-        <w:t>8 of the 11 banks charge more than the market average; only Home Credit, Freedom and VTB are below it.</w:t>
+        <w:t>8 of the 11 rates are above the NBK reference; Home Credit, Freedom and VTB are below it.</w:t>
       </w:r>
     </w:p>
     <w:p>
@@ -5138,7 +5138,7 @@
           <w:sz w:val="24"/>
           <w:szCs w:val="24"/>
         </w:rPr>
-        <w:t>Figure 6. Effective rates by bank (bankchart.kz, 31.07.2026) against inflation, the NBK base rate and the market average; red bars are above the market average.</w:t>
+        <w:t>Figure 6. Bankchart effective rates (31.07.2026) with inflation, the NBK base rate and the NBK loan-rate reference; red bars exceed the NBK reference.</w:t>
       </w:r>
     </w:p>
     <w:p>
@@ -5249,15 +5249,15 @@
           <w:sz w:val="24"/>
           <w:szCs w:val="24"/>
         </w:rPr>
-        <w:t>Credit is expensive in real terms.</w:t>
-      </w:r>
-      <w:r>
-        <w:rPr>
-          <w:rFonts w:ascii="Times New Roman" w:hAnsi="Times New Roman" w:cs="Times New Roman"/>
-          <w:sz w:val="24"/>
-          <w:szCs w:val="24"/>
-        </w:rPr>
-        <w:t xml:space="preserve"> Consumer loan rates have never been below inflation in the observed period, and the average spread over inflation is about 10 p.p. The 2026 rate (about 22%) is the highest annual average in the dataset.</w:t>
+        <w:t>Loan rates exceed inflation.</w:t>
+      </w:r>
+      <w:r>
+        <w:rPr>
+          <w:rFonts w:ascii="Times New Roman" w:hAnsi="Times New Roman" w:cs="Times New Roman"/>
+          <w:sz w:val="24"/>
+          <w:szCs w:val="24"/>
+        </w:rPr>
+        <w:t xml:space="preserve"> For the 19 years shared by the annual NBK and World Bank series (2005–2023), the average rate–inflation gap is about 10 p.p. The January–August 2026 mean (about 22%) is the highest among the annual summaries shown, but covers only 8 months.</w:t>
       </w:r>
     </w:p>
     <w:p>
@@ -5289,7 +5289,7 @@
           <w:sz w:val="24"/>
           <w:szCs w:val="24"/>
         </w:rPr>
-        <w:t xml:space="preserve"> They move within a narrow band and are almost independent of inflation (r = −0.15) and other macro indicators. Short periods of low real cost, such as 2008, 2016 and 2022–2023, occurred because inflation jumped while loan rates did not follow.</w:t>
+        <w:t xml:space="preserve"> The annual NBK means move within a narrow band and show a weak correlation with inflation (r = −0.15) and the other macro indicators in this sample. Short periods of low real cost, such as 2008, 2016 and 2022–2023, occurred because inflation jumped while loan rates did not follow.</w:t>
       </w:r>
     </w:p>
     <w:p>
@@ -5452,7 +5452,7 @@
           <w:sz w:val="24"/>
           <w:szCs w:val="24"/>
         </w:rPr>
-        <w:t>World Bank indicators are available for 2005-2023, and the latest values are taken as benchmarks for 2026.</w:t>
+        <w:t>World Bank annual indicators cover 2005–2023. Missing values for later years are not filled; the August 2026 inflation reference is entered separately.</w:t>
       </w:r>
     </w:p>
     <w:p>
@@ -5500,7 +5500,7 @@
           <w:sz w:val="24"/>
           <w:szCs w:val="24"/>
         </w:rPr>
-        <w:t>T</w:t>
+        <w:t>The historical NBK series covers loans to individuals, including individual entrepreneurs, in KZT; the bank comparison covers consumer cash loans. Annual NBK figures are means of monthly rates, and 2026 covers only eight months. The reference indicators and the Bankchart rating have different dates.</w:t>
       </w:r>
       <w:r>
         <w:rPr>
@@ -5509,7 +5509,7 @@
           <w:sz w:val="24"/>
           <w:szCs w:val="24"/>
         </w:rPr>
-        <w:t>he long-term analysis is based on annual averages, and the comparison of banks is devoted to consumer loans in cash.</w:t>
+        <w:t/>
       </w:r>
     </w:p>
     <w:p>

</xml_diff>